<commit_message>
Update Fire Extinguishing Devices Trade.docx
</commit_message>
<xml_diff>
--- a/Documentation/Fire Extinguishing Devices Trade.docx
+++ b/Documentation/Fire Extinguishing Devices Trade.docx
@@ -3036,19 +3036,7 @@
           <w:rPr>
             <w:rStyle w:val="Hyperlink"/>
           </w:rPr>
-          <w:t>https://jinghongdr</w:t>
-        </w:r>
-        <w:r>
-          <w:rPr>
-            <w:rStyle w:val="Hyperlink"/>
-          </w:rPr>
-          <w:t>o</w:t>
-        </w:r>
-        <w:r>
-          <w:rPr>
-            <w:rStyle w:val="Hyperlink"/>
-          </w:rPr>
-          <w:t>ne.com/fire-extinguishing-bomb-deployment-device</w:t>
+          <w:t>https://jinghongdrone.com/fire-extinguishing-bomb-deployment-device</w:t>
         </w:r>
       </w:hyperlink>
       <w:r>
@@ -3077,19 +3065,7 @@
           <w:rPr>
             <w:rStyle w:val="Hyperlink"/>
           </w:rPr>
-          <w:t>https://www.y</w:t>
-        </w:r>
-        <w:r>
-          <w:rPr>
-            <w:rStyle w:val="Hyperlink"/>
-          </w:rPr>
-          <w:t>o</w:t>
-        </w:r>
-        <w:r>
-          <w:rPr>
-            <w:rStyle w:val="Hyperlink"/>
-          </w:rPr>
-          <w:t>utube.com/shorts/bTtY0pKd4pU</w:t>
+          <w:t>https://www.youtube.com/shorts/bTtY0pKd4pU</w:t>
         </w:r>
       </w:hyperlink>
       <w:r>
@@ -3930,6 +3906,16 @@
           <w:lang w:val="de-DE"/>
         </w:rPr>
         <w:t>Sego : Parameters</w:t>
+      </w:r>
+      <w:r>
+        <w:rPr>
+          <w:b/>
+          <w:bCs/>
+          <w:sz w:val="40"/>
+          <w:szCs w:val="40"/>
+          <w:lang w:val="de-DE"/>
+        </w:rPr>
+        <w:t>,</w:t>
       </w:r>
     </w:p>
     <w:p>
@@ -5169,6 +5155,7 @@
   <w:style w:type="character" w:default="1" w:styleId="DefaultParagraphFont">
     <w:name w:val="Default Paragraph Font"/>
     <w:uiPriority w:val="1"/>
+    <w:semiHidden/>
     <w:unhideWhenUsed/>
   </w:style>
   <w:style w:type="table" w:default="1" w:styleId="TableNormal">

</xml_diff>